<commit_message>
New feature added in chat
</commit_message>
<xml_diff>
--- a/Deployment Guide in Railway.docx
+++ b/Deployment Guide in Railway.docx
@@ -168,6 +168,7 @@
       </w:pPr>
       <w:r>
         <w:rPr>
+          <w:noProof/>
           <w:sz w:val="36"/>
           <w:szCs w:val="36"/>
         </w:rPr>
@@ -339,6 +340,7 @@
       </w:pPr>
       <w:r>
         <w:rPr>
+          <w:noProof/>
           <w:sz w:val="36"/>
           <w:szCs w:val="36"/>
         </w:rPr>
@@ -551,6 +553,7 @@
       </w:pPr>
       <w:r>
         <w:rPr>
+          <w:noProof/>
           <w:sz w:val="36"/>
           <w:szCs w:val="36"/>
         </w:rPr>
@@ -627,6 +630,7 @@
       </w:pPr>
       <w:r>
         <w:rPr>
+          <w:noProof/>
           <w:sz w:val="36"/>
           <w:szCs w:val="36"/>
         </w:rPr>
@@ -702,21 +706,7 @@
           <w:sz w:val="36"/>
           <w:szCs w:val="36"/>
         </w:rPr>
-        <w:t xml:space="preserve">Open </w:t>
-      </w:r>
-      <w:r>
-        <w:rPr>
-          <w:sz w:val="36"/>
-          <w:szCs w:val="36"/>
-        </w:rPr>
-        <w:t>backend</w:t>
-      </w:r>
-      <w:r>
-        <w:rPr>
-          <w:sz w:val="36"/>
-          <w:szCs w:val="36"/>
-        </w:rPr>
-        <w:t xml:space="preserve"> service</w:t>
+        <w:t>Open backend service</w:t>
       </w:r>
       <w:r>
         <w:rPr>
@@ -832,21 +822,7 @@
           <w:sz w:val="36"/>
           <w:szCs w:val="36"/>
         </w:rPr>
-        <w:t>And Root Directory as /</w:t>
-      </w:r>
-      <w:r>
-        <w:rPr>
-          <w:sz w:val="36"/>
-          <w:szCs w:val="36"/>
-        </w:rPr>
-        <w:t>backend</w:t>
-      </w:r>
-      <w:r>
-        <w:rPr>
-          <w:sz w:val="36"/>
-          <w:szCs w:val="36"/>
-        </w:rPr>
-        <w:t xml:space="preserve"> (because we have 2 separate </w:t>
+        <w:t xml:space="preserve">And Root Directory as /backend (because we have 2 separate </w:t>
       </w:r>
       <w:proofErr w:type="gramStart"/>
       <w:r>
@@ -893,6 +869,7 @@
       </w:pPr>
       <w:r>
         <w:rPr>
+          <w:noProof/>
           <w:sz w:val="36"/>
           <w:szCs w:val="36"/>
         </w:rPr>
@@ -980,6 +957,7 @@
       </w:pPr>
       <w:r>
         <w:rPr>
+          <w:noProof/>
           <w:sz w:val="36"/>
           <w:szCs w:val="36"/>
         </w:rPr>
@@ -1049,6 +1027,7 @@
       </w:pPr>
       <w:r>
         <w:rPr>
+          <w:noProof/>
           <w:sz w:val="36"/>
           <w:szCs w:val="36"/>
         </w:rPr>
@@ -1117,6 +1096,7 @@
       </w:pPr>
       <w:r>
         <w:rPr>
+          <w:noProof/>
           <w:sz w:val="36"/>
           <w:szCs w:val="36"/>
         </w:rPr>
@@ -1336,9 +1316,6 @@
         <w:pStyle w:val="ListParagraph"/>
       </w:pPr>
       <w:r>
-        <w:rPr>
-          <w:lang w:val="fr-CA"/>
-        </w:rPr>
         <w:t>VITE_MOCK_AUTH</w:t>
       </w:r>
       <w:r>
@@ -1427,19 +1404,10 @@
         <w:pStyle w:val="ListParagraph"/>
       </w:pPr>
       <w:r>
-        <w:t xml:space="preserve">      - make sure the Application ID URI is set, usually api://&lt;backend-app-client-id&gt;   </w:t>
-      </w:r>
-      <w:r>
-        <w:t xml:space="preserve">FOR EXAMPLE </w:t>
-      </w:r>
-      <w:r>
-        <w:t>api://</w:t>
-      </w:r>
-      <w:r>
-        <w:t xml:space="preserve"> </w:t>
-      </w:r>
-      <w:r>
-        <w:t>bf77405d-23c8-4642-9c2c-72ef85201def</w:t>
+        <w:t xml:space="preserve">      - make sure the Application ID URI is set, usually api://&lt;backend-app-client-id&gt;   FOR EXAMPLE api://</w:t>
+      </w:r>
+      <w:r>
+        <w:t xml:space="preserve"> bf77405d-23c8-4642-9c2c-72ef85201def</w:t>
       </w:r>
     </w:p>
     <w:p>
@@ -1511,25 +1479,22 @@
         <w:pStyle w:val="ListParagraph"/>
       </w:pPr>
       <w:r>
-        <w:t xml:space="preserve">In railway go to </w:t>
-      </w:r>
-      <w:r>
-        <w:t>backend</w:t>
-      </w:r>
-      <w:r>
-        <w:t xml:space="preserve"> service and create the variables.</w:t>
-      </w:r>
-    </w:p>
-    <w:p>
-      <w:pPr>
-        <w:pStyle w:val="ListParagraph"/>
-      </w:pPr>
-    </w:p>
-    <w:p>
-      <w:pPr>
-        <w:pStyle w:val="ListParagraph"/>
-      </w:pPr>
-      <w:r>
+        <w:t>In railway go to backend service and create the variables.</w:t>
+      </w:r>
+    </w:p>
+    <w:p>
+      <w:pPr>
+        <w:pStyle w:val="ListParagraph"/>
+      </w:pPr>
+    </w:p>
+    <w:p>
+      <w:pPr>
+        <w:pStyle w:val="ListParagraph"/>
+      </w:pPr>
+      <w:r>
+        <w:rPr>
+          <w:noProof/>
+        </w:rPr>
         <w:drawing>
           <wp:inline distT="0" distB="0" distL="0" distR="0" wp14:anchorId="6AEF40EB" wp14:editId="7B143EBF">
             <wp:extent cx="5943600" cy="2913380"/>
@@ -1650,19 +1615,7 @@
         <w:rPr>
           <w:lang w:val="fr-CA"/>
         </w:rPr>
-        <w:t xml:space="preserve"> </w:t>
-      </w:r>
-      <w:r>
-        <w:rPr>
-          <w:lang w:val="fr-CA"/>
-        </w:rPr>
-        <w:t>a9u8Q~8W4zQyTQH5KEXrcV6y0xsMfR</w:t>
-      </w:r>
-      <w:r>
-        <w:rPr>
-          <w:lang w:val="fr-CA"/>
-        </w:rPr>
-        <w:t>*</w:t>
+        <w:t xml:space="preserve"> a9u8Q~8W4zQyTQH5KEXrcV6y0xsMfR*</w:t>
       </w:r>
       <w:r>
         <w:rPr>
@@ -1932,10 +1885,14 @@
           <w:sz w:val="27"/>
           <w:szCs w:val="27"/>
           <w:shd w:val="clear" w:color="auto" w:fill="13111C"/>
+          <w:lang w:val="fr-CA"/>
         </w:rPr>
         <w:t xml:space="preserve"> </w:t>
       </w:r>
       <w:r>
+        <w:rPr>
+          <w:lang w:val="fr-CA"/>
+        </w:rPr>
         <w:t>d3375b13-033c-4890-90fe-ba6bbe0153e0</w:t>
       </w:r>
     </w:p>
@@ -1950,8 +1907,14 @@
     <w:p>
       <w:pPr>
         <w:pStyle w:val="ListParagraph"/>
-      </w:pPr>
-      <w:r>
+        <w:rPr>
+          <w:lang w:val="fr-CA"/>
+        </w:rPr>
+      </w:pPr>
+      <w:r>
+        <w:rPr>
+          <w:lang w:val="fr-CA"/>
+        </w:rPr>
         <w:t>ENVIRONMENT</w:t>
       </w:r>
       <w:r>
@@ -1964,10 +1927,14 @@
           <w:sz w:val="27"/>
           <w:szCs w:val="27"/>
           <w:shd w:val="clear" w:color="auto" w:fill="13111C"/>
+          <w:lang w:val="fr-CA"/>
         </w:rPr>
         <w:t xml:space="preserve"> </w:t>
       </w:r>
       <w:r>
+        <w:rPr>
+          <w:lang w:val="fr-CA"/>
+        </w:rPr>
         <w:t>PRODUCTION</w:t>
       </w:r>
     </w:p>
@@ -2088,6 +2055,9 @@
         <w:pStyle w:val="ListParagraph"/>
       </w:pPr>
       <w:r>
+        <w:rPr>
+          <w:noProof/>
+        </w:rPr>
         <w:drawing>
           <wp:inline distT="0" distB="0" distL="0" distR="0" wp14:anchorId="7176BAA4" wp14:editId="309DD28C">
             <wp:extent cx="5943600" cy="4458970"/>
@@ -2151,6 +2121,9 @@
         <w:pStyle w:val="ListParagraph"/>
       </w:pPr>
       <w:r>
+        <w:rPr>
+          <w:noProof/>
+        </w:rPr>
         <w:lastRenderedPageBreak/>
         <w:drawing>
           <wp:inline distT="0" distB="0" distL="0" distR="0" wp14:anchorId="5822EEF1" wp14:editId="78D7503A">
@@ -2204,6 +2177,9 @@
         <w:pStyle w:val="ListParagraph"/>
       </w:pPr>
       <w:r>
+        <w:rPr>
+          <w:noProof/>
+        </w:rPr>
         <w:drawing>
           <wp:inline distT="0" distB="0" distL="0" distR="0" wp14:anchorId="36C729B1" wp14:editId="318EEFEC">
             <wp:extent cx="5943600" cy="2915285"/>
@@ -2283,6 +2259,9 @@
         <w:pStyle w:val="ListParagraph"/>
       </w:pPr>
       <w:r>
+        <w:rPr>
+          <w:noProof/>
+        </w:rPr>
         <w:lastRenderedPageBreak/>
         <w:drawing>
           <wp:inline distT="0" distB="0" distL="0" distR="0" wp14:anchorId="12887716" wp14:editId="5849B8DC">
@@ -4419,6 +4398,7 @@
   <w:style w:type="character" w:default="1" w:styleId="DefaultParagraphFont">
     <w:name w:val="Default Paragraph Font"/>
     <w:uiPriority w:val="1"/>
+    <w:semiHidden/>
     <w:unhideWhenUsed/>
   </w:style>
   <w:style w:type="table" w:default="1" w:styleId="TableNormal">

</xml_diff>